<commit_message>
Update Lambda Setup Instructions.docx
</commit_message>
<xml_diff>
--- a/LAMBDA/LINEAR_LEARNER/Lambda Setup Instructions.docx
+++ b/LAMBDA/LINEAR_LEARNER/Lambda Setup Instructions.docx
@@ -354,8 +354,9 @@
       <w:r>
         <w:rPr>
           <w:rStyle w:val="VerbatimChar"/>
-        </w:rPr>
-        <w:t>amesHousing_regression</w:t>
+          <w:smallCaps w:val="0"/>
+        </w:rPr>
+        <w:t>ameshousing_regression</w:t>
       </w:r>
       <w:r>
         <w:t xml:space="preserve"> (or any descriptive name you prefer. Function names can only contain letters, numbers, hyphens, and underscores. Spaces are not allowed.)</w:t>
@@ -637,7 +638,7 @@
         <w:rPr>
           <w:rStyle w:val="VerbatimChar"/>
         </w:rPr>
-        <w:t>"your-regression-endpoint-name"</w:t>
+        <w:t>"linear-learner-endpoint"</w:t>
       </w:r>
       <w:r>
         <w:t xml:space="preserve"> with your actual SageMaker endpoint name from your notebook.</w:t>
@@ -897,6 +898,7 @@
         </w:numPr>
       </w:pPr>
       <w:r>
+        <w:lastRenderedPageBreak/>
         <w:t xml:space="preserve">Click </w:t>
       </w:r>
       <w:r>
@@ -919,7 +921,6 @@
         </w:numPr>
       </w:pPr>
       <w:r>
-        <w:lastRenderedPageBreak/>
         <w:t xml:space="preserve">Verify that you get a </w:t>
       </w:r>
       <w:r>
@@ -1138,6 +1139,48 @@
       </w:r>
       <w:r>
         <w:t xml:space="preserve"> value is the model’s predicted sale price in US dollars. Your exact number will vary depending on your trained model.</w:t>
+      </w:r>
+    </w:p>
+    <w:p>
+      <w:pPr>
+        <w:pStyle w:val="FirstParagraph"/>
+      </w:pPr>
+      <w:r>
+        <w:rPr>
+          <w:b/>
+          <w:bCs/>
+        </w:rPr>
+        <w:t>Note:</w:t>
+      </w:r>
+      <w:r>
+        <w:t xml:space="preserve"> The actual response also includes a </w:t>
+      </w:r>
+      <w:r>
+        <w:rPr>
+          <w:rStyle w:val="VerbatimChar"/>
+        </w:rPr>
+        <w:t>headers</w:t>
+      </w:r>
+      <w:r>
+        <w:t xml:space="preserve"> field with CORS headers. You can ignore the headers section and focus on the </w:t>
+      </w:r>
+      <w:r>
+        <w:rPr>
+          <w:rStyle w:val="VerbatimChar"/>
+        </w:rPr>
+        <w:t>statusCode</w:t>
+      </w:r>
+      <w:r>
+        <w:t xml:space="preserve"> and </w:t>
+      </w:r>
+      <w:r>
+        <w:rPr>
+          <w:rStyle w:val="VerbatimChar"/>
+        </w:rPr>
+        <w:t>body</w:t>
+      </w:r>
+      <w:r>
+        <w:t xml:space="preserve"> fields to verify your function is working correctly.</w:t>
       </w:r>
     </w:p>
     <w:p>
@@ -1457,6 +1500,7 @@
       <w:bookmarkStart w:id="12" w:name="import-error"/>
       <w:bookmarkEnd w:id="11"/>
       <w:r>
+        <w:lastRenderedPageBreak/>
         <w:t>Import Error</w:t>
       </w:r>
     </w:p>
@@ -1493,7 +1537,6 @@
           <w:b/>
           <w:bCs/>
         </w:rPr>
-        <w:lastRenderedPageBreak/>
         <w:t>Solution:</w:t>
       </w:r>
       <w:r>
@@ -2337,6 +2380,13 @@
     <w:lsdException w:name="No Spacing" w:uiPriority="1" w:qFormat="1"/>
     <w:lsdException w:name="Light Shading"/>
     <w:lsdException w:name="Light List"/>
+    <w:lsdException w:name="Light Grid"/>
+    <w:lsdException w:name="Medium Shading 1"/>
+    <w:lsdException w:name="Medium Shading 2"/>
+    <w:lsdException w:name="Medium List 1"/>
+    <w:lsdException w:name="Medium List 2"/>
+    <w:lsdException w:name="Medium Grid 1"/>
+    <w:lsdException w:name="Medium Grid 2"/>
     <w:lsdException w:name="Medium Grid 3"/>
     <w:lsdException w:name="Dark List"/>
     <w:lsdException w:name="Colorful Shading"/>

</xml_diff>